<commit_message>
Deja escrito el consentimiento de las entrevistadas
El repositorio ahora es publico, asi que el documento de entrevistas
—que nombra a los emprendimientos por su nombre comercial— quedo a la
vista de cualquiera. Las tres entrevistadas habian dado su
consentimiento, pero eso no estaba dicho en ningun lado.

Ahora esta en dos lugares: al pie del propio documento, y en un README
de la carpeta, que es lo que se ve al entrar sin tener que descargar
nada.

Se aclara tambien que no se publican telefonos, direcciones ni
documentos de identidad, cosa que se verifico revisando todo el
historial del repositorio antes de abrirlo.

Co-Authored-By: Claude Opus 5 <noreply@anthropic.com>
Claude-Session: https://claude.ai/code/session_01C7nSogJwyiEsYbPQRqSg1t
</commit_message>
<xml_diff>
--- a/entrevistas/Entrevistas-Minga-Consolidado.docx
+++ b/entrevistas/Entrevistas-Minga-Consolidado.docx
@@ -2137,6 +2137,17 @@
           <w:szCs w:val="18"/>
         </w:rPr>
         <w:t xml:space="preserve">Minga · Hackathon Stellar PULSO 2026 · Salta, Argentina 🇦🇷</w:t>
+      </w:r>
+    </w:p>
+    <w:p>
+      <w:pPr>
+        <w:spacing w:before="240"/>
+      </w:pPr>
+      <w:r>
+        <w:rPr>
+          <w:i/>
+        </w:rPr>
+        <w:t xml:space="preserve">Las tres entrevistadas dieron su consentimiento para que su testimonio y el nombre de su emprendimiento aparezcan en este documento, que es público.</w:t>
       </w:r>
     </w:p>
     <w:sectPr>

</xml_diff>